<commit_message>
add complete project documentation
</commit_message>
<xml_diff>
--- a/IndusCart_Complete_Project_Documentation.docx
+++ b/IndusCart_Complete_Project_Documentation.docx
@@ -17,6 +17,7 @@
           <w:szCs w:val="66"/>
         </w:rPr>
       </w:pPr>
+      <w:proofErr w:type="spellStart"/>
       <w:r>
         <w:rPr>
           <w:rFonts w:ascii="Arial" w:eastAsia="Times New Roman" w:hAnsi="Arial" w:cs="Arial"/>
@@ -29,6 +30,7 @@
         </w:rPr>
         <w:t>IndusCart</w:t>
       </w:r>
+      <w:proofErr w:type="spellEnd"/>
     </w:p>
     <w:p>
       <w:pPr>
@@ -288,6 +290,7 @@
                 <w:szCs w:val="18"/>
               </w:rPr>
             </w:pPr>
+            <w:proofErr w:type="spellStart"/>
             <w:r>
               <w:rPr>
                 <w:rFonts w:ascii="Arial" w:eastAsia="Times New Roman" w:hAnsi="Arial" w:cs="Arial"/>
@@ -297,6 +300,7 @@
               </w:rPr>
               <w:t>IndusCart</w:t>
             </w:r>
+            <w:proofErr w:type="spellEnd"/>
           </w:p>
         </w:tc>
       </w:tr>
@@ -607,7 +611,27 @@
                 <w:sz w:val="18"/>
                 <w:szCs w:val="18"/>
               </w:rPr>
-              <w:t>JWT bearer sessions with bcrypt password hashing</w:t>
+              <w:t xml:space="preserve">JWT bearer sessions with </w:t>
+            </w:r>
+            <w:proofErr w:type="spellStart"/>
+            <w:r>
+              <w:rPr>
+                <w:rFonts w:ascii="Arial" w:eastAsia="Times New Roman" w:hAnsi="Arial" w:cs="Arial"/>
+                <w:color w:val="1F2937"/>
+                <w:sz w:val="18"/>
+                <w:szCs w:val="18"/>
+              </w:rPr>
+              <w:t>bcrypt</w:t>
+            </w:r>
+            <w:proofErr w:type="spellEnd"/>
+            <w:r>
+              <w:rPr>
+                <w:rFonts w:ascii="Arial" w:eastAsia="Times New Roman" w:hAnsi="Arial" w:cs="Arial"/>
+                <w:color w:val="1F2937"/>
+                <w:sz w:val="18"/>
+                <w:szCs w:val="18"/>
+              </w:rPr>
+              <w:t xml:space="preserve"> password hashing</w:t>
             </w:r>
           </w:p>
         </w:tc>
@@ -800,14 +824,25 @@
         </w:rPr>
         <w:t xml:space="preserve"> </w:t>
       </w:r>
-      <w:r>
-        <w:rPr>
-          <w:rFonts w:ascii="Arial" w:eastAsia="Times New Roman" w:hAnsi="Arial" w:cs="Arial"/>
-          <w:color w:val="1F2937"/>
-          <w:sz w:val="21"/>
-          <w:szCs w:val="21"/>
-        </w:rPr>
-        <w:t>IndusCart lets customers discover products, choose local or international pricing, add product variants to a persistent cart, place an order, view its status, and contact support; administrators manage products, inventory, orders, COD settings, and support tickets.</w:t>
+      <w:proofErr w:type="spellStart"/>
+      <w:r>
+        <w:rPr>
+          <w:rFonts w:ascii="Arial" w:eastAsia="Times New Roman" w:hAnsi="Arial" w:cs="Arial"/>
+          <w:color w:val="1F2937"/>
+          <w:sz w:val="21"/>
+          <w:szCs w:val="21"/>
+        </w:rPr>
+        <w:t>IndusCart</w:t>
+      </w:r>
+      <w:proofErr w:type="spellEnd"/>
+      <w:r>
+        <w:rPr>
+          <w:rFonts w:ascii="Arial" w:eastAsia="Times New Roman" w:hAnsi="Arial" w:cs="Arial"/>
+          <w:color w:val="1F2937"/>
+          <w:sz w:val="21"/>
+          <w:szCs w:val="21"/>
+        </w:rPr>
+        <w:t xml:space="preserve"> lets customers discover products, choose local or international pricing, add product variants to a persistent cart, place an order, view its status, and contact support; administrators manage products, inventory, orders, COD settings, and support tickets.</w:t>
       </w:r>
     </w:p>
     <w:p>
@@ -894,7 +929,27 @@
           <w:sz w:val="21"/>
           <w:szCs w:val="21"/>
         </w:rPr>
-        <w:t>Persistent cart with product + colour + size identity, checkout address validation, server-side price/stock/visibility/variant validation, zone-based shipping, COD fee rules, and order creation.</w:t>
+        <w:t xml:space="preserve">Persistent cart with product + </w:t>
+      </w:r>
+      <w:proofErr w:type="spellStart"/>
+      <w:r>
+        <w:rPr>
+          <w:rFonts w:ascii="Arial" w:eastAsia="Times New Roman" w:hAnsi="Arial" w:cs="Arial"/>
+          <w:color w:val="1F2937"/>
+          <w:sz w:val="21"/>
+          <w:szCs w:val="21"/>
+        </w:rPr>
+        <w:t>colour</w:t>
+      </w:r>
+      <w:proofErr w:type="spellEnd"/>
+      <w:r>
+        <w:rPr>
+          <w:rFonts w:ascii="Arial" w:eastAsia="Times New Roman" w:hAnsi="Arial" w:cs="Arial"/>
+          <w:color w:val="1F2937"/>
+          <w:sz w:val="21"/>
+          <w:szCs w:val="21"/>
+        </w:rPr>
+        <w:t xml:space="preserve"> + size identity, checkout address validation, server-side price/stock/visibility/variant validation, zone-based shipping, COD fee rules, and order creation.</w:t>
       </w:r>
     </w:p>
     <w:p>
@@ -942,7 +997,27 @@
           <w:sz w:val="21"/>
           <w:szCs w:val="21"/>
         </w:rPr>
-        <w:t>Admin product create/update/delete, multiple image uploads, visibility, market restriction, stock, weight, price, category, brand, model, colour and size fields.</w:t>
+        <w:t xml:space="preserve">Admin product create/update/delete, multiple image uploads, visibility, market restriction, stock, weight, price, category, brand, model, </w:t>
+      </w:r>
+      <w:proofErr w:type="spellStart"/>
+      <w:r>
+        <w:rPr>
+          <w:rFonts w:ascii="Arial" w:eastAsia="Times New Roman" w:hAnsi="Arial" w:cs="Arial"/>
+          <w:color w:val="1F2937"/>
+          <w:sz w:val="21"/>
+          <w:szCs w:val="21"/>
+        </w:rPr>
+        <w:t>colour</w:t>
+      </w:r>
+      <w:proofErr w:type="spellEnd"/>
+      <w:r>
+        <w:rPr>
+          <w:rFonts w:ascii="Arial" w:eastAsia="Times New Roman" w:hAnsi="Arial" w:cs="Arial"/>
+          <w:color w:val="1F2937"/>
+          <w:sz w:val="21"/>
+          <w:szCs w:val="21"/>
+        </w:rPr>
+        <w:t xml:space="preserve"> and size fields.</w:t>
       </w:r>
     </w:p>
     <w:p>
@@ -1028,7 +1103,47 @@
           <w:sz w:val="21"/>
           <w:szCs w:val="21"/>
         </w:rPr>
-        <w:t>Real payment capture/refunds/webhooks for Stripe, PayPal, JazzCash, and EasyPaisa. The current system records the selected payment method; it does not capture money.</w:t>
+        <w:t xml:space="preserve">Real payment capture/refunds/webhooks for Stripe, PayPal, </w:t>
+      </w:r>
+      <w:proofErr w:type="spellStart"/>
+      <w:r>
+        <w:rPr>
+          <w:rFonts w:ascii="Arial" w:eastAsia="Times New Roman" w:hAnsi="Arial" w:cs="Arial"/>
+          <w:color w:val="1F2937"/>
+          <w:sz w:val="21"/>
+          <w:szCs w:val="21"/>
+        </w:rPr>
+        <w:t>JazzCash</w:t>
+      </w:r>
+      <w:proofErr w:type="spellEnd"/>
+      <w:r>
+        <w:rPr>
+          <w:rFonts w:ascii="Arial" w:eastAsia="Times New Roman" w:hAnsi="Arial" w:cs="Arial"/>
+          <w:color w:val="1F2937"/>
+          <w:sz w:val="21"/>
+          <w:szCs w:val="21"/>
+        </w:rPr>
+        <w:t xml:space="preserve">, and </w:t>
+      </w:r>
+      <w:proofErr w:type="spellStart"/>
+      <w:r>
+        <w:rPr>
+          <w:rFonts w:ascii="Arial" w:eastAsia="Times New Roman" w:hAnsi="Arial" w:cs="Arial"/>
+          <w:color w:val="1F2937"/>
+          <w:sz w:val="21"/>
+          <w:szCs w:val="21"/>
+        </w:rPr>
+        <w:t>EasyPaisa</w:t>
+      </w:r>
+      <w:proofErr w:type="spellEnd"/>
+      <w:r>
+        <w:rPr>
+          <w:rFonts w:ascii="Arial" w:eastAsia="Times New Roman" w:hAnsi="Arial" w:cs="Arial"/>
+          <w:color w:val="1F2937"/>
+          <w:sz w:val="21"/>
+          <w:szCs w:val="21"/>
+        </w:rPr>
+        <w:t>. The current system records the selected payment method; it does not capture money.</w:t>
       </w:r>
     </w:p>
     <w:p>
@@ -1052,7 +1167,27 @@
           <w:sz w:val="21"/>
           <w:szCs w:val="21"/>
         </w:rPr>
-        <w:t>Real courier provider adapters. Courier settings are stored, but dispatch safely returns provider_not_supported.</w:t>
+        <w:t xml:space="preserve">Real courier provider adapters. Courier settings are stored, but dispatch safely returns </w:t>
+      </w:r>
+      <w:proofErr w:type="spellStart"/>
+      <w:r>
+        <w:rPr>
+          <w:rFonts w:ascii="Arial" w:eastAsia="Times New Roman" w:hAnsi="Arial" w:cs="Arial"/>
+          <w:color w:val="1F2937"/>
+          <w:sz w:val="21"/>
+          <w:szCs w:val="21"/>
+        </w:rPr>
+        <w:t>provider_not_supported</w:t>
+      </w:r>
+      <w:proofErr w:type="spellEnd"/>
+      <w:r>
+        <w:rPr>
+          <w:rFonts w:ascii="Arial" w:eastAsia="Times New Roman" w:hAnsi="Arial" w:cs="Arial"/>
+          <w:color w:val="1F2937"/>
+          <w:sz w:val="21"/>
+          <w:szCs w:val="21"/>
+        </w:rPr>
+        <w:t>.</w:t>
       </w:r>
     </w:p>
     <w:p>
@@ -1076,7 +1211,27 @@
           <w:sz w:val="21"/>
           <w:szCs w:val="21"/>
         </w:rPr>
-        <w:t>Automated returns/refunds workflow, notifications/email/SMS/push, customer profile editing, reviews, wishlist, coupons, and analytics beyond admin summary KPIs.</w:t>
+        <w:t xml:space="preserve">Automated returns/refunds workflow, notifications/email/SMS/push, customer profile editing, reviews, </w:t>
+      </w:r>
+      <w:proofErr w:type="spellStart"/>
+      <w:r>
+        <w:rPr>
+          <w:rFonts w:ascii="Arial" w:eastAsia="Times New Roman" w:hAnsi="Arial" w:cs="Arial"/>
+          <w:color w:val="1F2937"/>
+          <w:sz w:val="21"/>
+          <w:szCs w:val="21"/>
+        </w:rPr>
+        <w:t>wishlist</w:t>
+      </w:r>
+      <w:proofErr w:type="spellEnd"/>
+      <w:r>
+        <w:rPr>
+          <w:rFonts w:ascii="Arial" w:eastAsia="Times New Roman" w:hAnsi="Arial" w:cs="Arial"/>
+          <w:color w:val="1F2937"/>
+          <w:sz w:val="21"/>
+          <w:szCs w:val="21"/>
+        </w:rPr>
+        <w:t>, coupons, and analytics beyond admin summary KPIs.</w:t>
       </w:r>
     </w:p>
     <w:p>
@@ -1457,6 +1612,7 @@
         <w:rPr>
           <w:rFonts w:ascii="Arial" w:eastAsia="Times New Roman" w:hAnsi="Arial" w:cs="Arial"/>
         </w:rPr>
+        <w:lastRenderedPageBreak/>
         <w:t>1. Business and non-technical document</w:t>
       </w:r>
     </w:p>
@@ -1484,6 +1640,7 @@
           <w:szCs w:val="21"/>
         </w:rPr>
       </w:pPr>
+      <w:proofErr w:type="spellStart"/>
       <w:r>
         <w:rPr>
           <w:rFonts w:ascii="Arial" w:hAnsi="Arial" w:cs="Arial"/>
@@ -1491,7 +1648,17 @@
           <w:sz w:val="21"/>
           <w:szCs w:val="21"/>
         </w:rPr>
-        <w:t>IndusCart is intended to connect customers with curated products from Pakistan and support both domestic and international ordering. The business proposition combines local craftsmanship, everyday products, a simple shopping experience, and an administrative control panel for catalog and fulfillment operations.</w:t>
+        <w:t>IndusCart</w:t>
+      </w:r>
+      <w:proofErr w:type="spellEnd"/>
+      <w:r>
+        <w:rPr>
+          <w:rFonts w:ascii="Arial" w:hAnsi="Arial" w:cs="Arial"/>
+          <w:color w:val="1F2937"/>
+          <w:sz w:val="21"/>
+          <w:szCs w:val="21"/>
+        </w:rPr>
+        <w:t xml:space="preserve"> is intended to connect customers with curated products from Pakistan and support both domestic and international ordering. The business proposition combines local craftsmanship, everyday products, a simple shopping experience, and an administrative control panel for catalog and fulfillment operations.</w:t>
       </w:r>
     </w:p>
     <w:p>
@@ -2161,6 +2328,7 @@
         <w:rPr>
           <w:rFonts w:ascii="Arial" w:eastAsia="Times New Roman" w:hAnsi="Arial" w:cs="Arial"/>
         </w:rPr>
+        <w:lastRenderedPageBreak/>
         <w:t>1.4 Business rules currently present</w:t>
       </w:r>
     </w:p>
@@ -2187,12 +2355,14 @@
         </w:rPr>
         <w:t xml:space="preserve">Local products marked </w:t>
       </w:r>
+      <w:proofErr w:type="spellStart"/>
       <w:r>
         <w:rPr>
           <w:rStyle w:val="HTMLCode"/>
         </w:rPr>
         <w:t>isLocal</w:t>
       </w:r>
+      <w:proofErr w:type="spellEnd"/>
       <w:r>
         <w:rPr>
           <w:rFonts w:ascii="Arial" w:eastAsia="Times New Roman" w:hAnsi="Arial" w:cs="Arial"/>
@@ -2946,6 +3116,7 @@
         <w:rPr>
           <w:rFonts w:ascii="Arial" w:eastAsia="Times New Roman" w:hAnsi="Arial" w:cs="Arial"/>
         </w:rPr>
+        <w:lastRenderedPageBreak/>
         <w:t>2. User documentation</w:t>
       </w:r>
     </w:p>
@@ -3096,7 +3267,27 @@
           <w:sz w:val="21"/>
           <w:szCs w:val="21"/>
         </w:rPr>
-        <w:t>Open a product, review images, description, stock, market restriction, colour/size, and price.</w:t>
+        <w:t xml:space="preserve">Open a product, review images, description, stock, market restriction, </w:t>
+      </w:r>
+      <w:proofErr w:type="spellStart"/>
+      <w:r>
+        <w:rPr>
+          <w:rFonts w:ascii="Arial" w:eastAsia="Times New Roman" w:hAnsi="Arial" w:cs="Arial"/>
+          <w:color w:val="1F2937"/>
+          <w:sz w:val="21"/>
+          <w:szCs w:val="21"/>
+        </w:rPr>
+        <w:t>colour</w:t>
+      </w:r>
+      <w:proofErr w:type="spellEnd"/>
+      <w:r>
+        <w:rPr>
+          <w:rFonts w:ascii="Arial" w:eastAsia="Times New Roman" w:hAnsi="Arial" w:cs="Arial"/>
+          <w:color w:val="1F2937"/>
+          <w:sz w:val="21"/>
+          <w:szCs w:val="21"/>
+        </w:rPr>
+        <w:t>/size, and price.</w:t>
       </w:r>
     </w:p>
     <w:p>
@@ -3598,6 +3789,7 @@
         <w:rPr>
           <w:rFonts w:ascii="Arial" w:eastAsia="Times New Roman" w:hAnsi="Arial" w:cs="Arial"/>
         </w:rPr>
+        <w:lastRenderedPageBreak/>
         <w:t>3. Software Requirements Document (SRD)</w:t>
       </w:r>
     </w:p>
@@ -3643,16 +3835,7 @@
           <w:sz w:val="21"/>
           <w:szCs w:val="21"/>
         </w:rPr>
-        <w:t xml:space="preserve"> </w:t>
-      </w:r>
-      <w:r>
-        <w:rPr>
-          <w:rFonts w:ascii="Arial" w:hAnsi="Arial" w:cs="Arial"/>
-          <w:color w:val="1F2937"/>
-          <w:sz w:val="21"/>
-          <w:szCs w:val="21"/>
-        </w:rPr>
-        <w:t>responsive web storefront, optional Android package, catalog administration, account authentication, cart/checkout, order lifecycle, support tickets, COD settings, zone shipping, uploads, MongoDB persistence, Docker development/deployment packaging.</w:t>
+        <w:t xml:space="preserve"> responsive web storefront, optional Android package, catalog administration, account authentication, cart/checkout, order lifecycle, support tickets, COD settings, zone shipping, uploads, MongoDB persistence, Docker development/deployment packaging.</w:t>
       </w:r>
     </w:p>
     <w:p>
@@ -3683,7 +3866,27 @@
           <w:sz w:val="21"/>
           <w:szCs w:val="21"/>
         </w:rPr>
-        <w:t xml:space="preserve"> real payment settlement, courier APIs/tracking, automated returns/refunds, marketing automation, reviews, wishlists, advanced analytics, multi-vendor settlement, and production legal/compliance sign-off.</w:t>
+        <w:t xml:space="preserve"> real payment settlement, courier APIs/tracking, automated returns/refunds, marketing automation, reviews, </w:t>
+      </w:r>
+      <w:proofErr w:type="spellStart"/>
+      <w:r>
+        <w:rPr>
+          <w:rFonts w:ascii="Arial" w:hAnsi="Arial" w:cs="Arial"/>
+          <w:color w:val="1F2937"/>
+          <w:sz w:val="21"/>
+          <w:szCs w:val="21"/>
+        </w:rPr>
+        <w:t>wishlists</w:t>
+      </w:r>
+      <w:proofErr w:type="spellEnd"/>
+      <w:r>
+        <w:rPr>
+          <w:rFonts w:ascii="Arial" w:hAnsi="Arial" w:cs="Arial"/>
+          <w:color w:val="1F2937"/>
+          <w:sz w:val="21"/>
+          <w:szCs w:val="21"/>
+        </w:rPr>
+        <w:t>, advanced analytics, multi-vendor settlement, and production legal/compliance sign-off.</w:t>
       </w:r>
     </w:p>
     <w:p>
@@ -4041,8 +4244,19 @@
                 <w:sz w:val="18"/>
                 <w:szCs w:val="18"/>
               </w:rPr>
-              <w:t>, JWT/bcrypt</w:t>
-            </w:r>
+              <w:t>, JWT/</w:t>
+            </w:r>
+            <w:proofErr w:type="spellStart"/>
+            <w:r>
+              <w:rPr>
+                <w:rFonts w:ascii="Arial" w:eastAsia="Times New Roman" w:hAnsi="Arial" w:cs="Arial"/>
+                <w:color w:val="1F2937"/>
+                <w:sz w:val="18"/>
+                <w:szCs w:val="18"/>
+              </w:rPr>
+              <w:t>bcrypt</w:t>
+            </w:r>
+            <w:proofErr w:type="spellEnd"/>
           </w:p>
         </w:tc>
       </w:tr>
@@ -4363,12 +4577,14 @@
                 <w:szCs w:val="18"/>
               </w:rPr>
             </w:pPr>
+            <w:proofErr w:type="spellStart"/>
             <w:r>
               <w:rPr>
                 <w:rStyle w:val="HTMLCode"/>
               </w:rPr>
               <w:t>HomePage.jsx</w:t>
             </w:r>
+            <w:proofErr w:type="spellEnd"/>
             <w:r>
               <w:rPr>
                 <w:rFonts w:ascii="Arial" w:eastAsia="Times New Roman" w:hAnsi="Arial" w:cs="Arial"/>
@@ -4523,20 +4739,42 @@
                 <w:szCs w:val="18"/>
               </w:rPr>
             </w:pPr>
+            <w:proofErr w:type="spellStart"/>
             <w:r>
               <w:rPr>
                 <w:rStyle w:val="HTMLCode"/>
               </w:rPr>
               <w:t>ProductDetailPage.jsx</w:t>
             </w:r>
-            <w:r>
-              <w:rPr>
-                <w:rFonts w:ascii="Arial" w:eastAsia="Times New Roman" w:hAnsi="Arial" w:cs="Arial"/>
-                <w:color w:val="1F2937"/>
-                <w:sz w:val="18"/>
-                <w:szCs w:val="18"/>
-              </w:rPr>
-              <w:t>, colour/size validation</w:t>
+            <w:proofErr w:type="spellEnd"/>
+            <w:r>
+              <w:rPr>
+                <w:rFonts w:ascii="Arial" w:eastAsia="Times New Roman" w:hAnsi="Arial" w:cs="Arial"/>
+                <w:color w:val="1F2937"/>
+                <w:sz w:val="18"/>
+                <w:szCs w:val="18"/>
+              </w:rPr>
+              <w:t xml:space="preserve">, </w:t>
+            </w:r>
+            <w:proofErr w:type="spellStart"/>
+            <w:r>
+              <w:rPr>
+                <w:rFonts w:ascii="Arial" w:eastAsia="Times New Roman" w:hAnsi="Arial" w:cs="Arial"/>
+                <w:color w:val="1F2937"/>
+                <w:sz w:val="18"/>
+                <w:szCs w:val="18"/>
+              </w:rPr>
+              <w:t>colour</w:t>
+            </w:r>
+            <w:proofErr w:type="spellEnd"/>
+            <w:r>
+              <w:rPr>
+                <w:rFonts w:ascii="Arial" w:eastAsia="Times New Roman" w:hAnsi="Arial" w:cs="Arial"/>
+                <w:color w:val="1F2937"/>
+                <w:sz w:val="18"/>
+                <w:szCs w:val="18"/>
+              </w:rPr>
+              <w:t>/size validation</w:t>
             </w:r>
           </w:p>
         </w:tc>
@@ -4683,21 +4921,34 @@
                 <w:szCs w:val="18"/>
               </w:rPr>
             </w:pPr>
+            <w:proofErr w:type="spellStart"/>
             <w:r>
               <w:rPr>
                 <w:rStyle w:val="HTMLCode"/>
               </w:rPr>
               <w:t>CartContext.jsx</w:t>
             </w:r>
-            <w:r>
-              <w:rPr>
-                <w:rFonts w:ascii="Arial" w:eastAsia="Times New Roman" w:hAnsi="Arial" w:cs="Arial"/>
-                <w:color w:val="1F2937"/>
-                <w:sz w:val="18"/>
-                <w:szCs w:val="18"/>
-              </w:rPr>
-              <w:t>, localStorage</w:t>
-            </w:r>
+            <w:proofErr w:type="spellEnd"/>
+            <w:r>
+              <w:rPr>
+                <w:rFonts w:ascii="Arial" w:eastAsia="Times New Roman" w:hAnsi="Arial" w:cs="Arial"/>
+                <w:color w:val="1F2937"/>
+                <w:sz w:val="18"/>
+                <w:szCs w:val="18"/>
+              </w:rPr>
+              <w:t xml:space="preserve">, </w:t>
+            </w:r>
+            <w:proofErr w:type="spellStart"/>
+            <w:r>
+              <w:rPr>
+                <w:rFonts w:ascii="Arial" w:eastAsia="Times New Roman" w:hAnsi="Arial" w:cs="Arial"/>
+                <w:color w:val="1F2937"/>
+                <w:sz w:val="18"/>
+                <w:szCs w:val="18"/>
+              </w:rPr>
+              <w:t>localStorage</w:t>
+            </w:r>
+            <w:proofErr w:type="spellEnd"/>
           </w:p>
         </w:tc>
       </w:tr>
@@ -4843,12 +5094,14 @@
                 <w:szCs w:val="18"/>
               </w:rPr>
             </w:pPr>
+            <w:proofErr w:type="spellStart"/>
             <w:r>
               <w:rPr>
                 <w:rStyle w:val="HTMLCode"/>
               </w:rPr>
               <w:t>CartPage.jsx</w:t>
             </w:r>
+            <w:proofErr w:type="spellEnd"/>
             <w:r>
               <w:rPr>
                 <w:rFonts w:ascii="Arial" w:eastAsia="Times New Roman" w:hAnsi="Arial" w:cs="Arial"/>
@@ -5056,6 +5309,7 @@
                 <w:sz w:val="18"/>
                 <w:szCs w:val="18"/>
               </w:rPr>
+              <w:lastRenderedPageBreak/>
               <w:t>FR-08</w:t>
             </w:r>
           </w:p>
@@ -5163,12 +5417,14 @@
                 <w:szCs w:val="18"/>
               </w:rPr>
             </w:pPr>
+            <w:proofErr w:type="spellStart"/>
             <w:r>
               <w:rPr>
                 <w:rStyle w:val="HTMLCode"/>
               </w:rPr>
               <w:t>OrdersPage.jsx</w:t>
             </w:r>
+            <w:proofErr w:type="spellEnd"/>
             <w:r>
               <w:rPr>
                 <w:rFonts w:ascii="Arial" w:eastAsia="Times New Roman" w:hAnsi="Arial" w:cs="Arial"/>
@@ -5178,12 +5434,14 @@
               </w:rPr>
               <w:t xml:space="preserve">, </w:t>
             </w:r>
+            <w:proofErr w:type="spellStart"/>
             <w:r>
               <w:rPr>
                 <w:rStyle w:val="HTMLCode"/>
               </w:rPr>
               <w:t>OrderTrackPage.jsx</w:t>
             </w:r>
+            <w:proofErr w:type="spellEnd"/>
           </w:p>
         </w:tc>
       </w:tr>
@@ -5329,12 +5587,14 @@
                 <w:szCs w:val="18"/>
               </w:rPr>
             </w:pPr>
+            <w:proofErr w:type="spellStart"/>
             <w:r>
               <w:rPr>
                 <w:rStyle w:val="HTMLCode"/>
               </w:rPr>
               <w:t>AdminPage.jsx</w:t>
             </w:r>
+            <w:proofErr w:type="spellEnd"/>
             <w:r>
               <w:rPr>
                 <w:rFonts w:ascii="Arial" w:eastAsia="Times New Roman" w:hAnsi="Arial" w:cs="Arial"/>
@@ -5519,12 +5779,14 @@
               </w:rPr>
               <w:t xml:space="preserve">, </w:t>
             </w:r>
+            <w:proofErr w:type="spellStart"/>
             <w:r>
               <w:rPr>
                 <w:rStyle w:val="HTMLCode"/>
               </w:rPr>
               <w:t>SupportPage.jsx</w:t>
             </w:r>
+            <w:proofErr w:type="spellEnd"/>
           </w:p>
         </w:tc>
       </w:tr>
@@ -5670,12 +5932,14 @@
                 <w:szCs w:val="18"/>
               </w:rPr>
             </w:pPr>
+            <w:proofErr w:type="spellStart"/>
             <w:r>
               <w:rPr>
                 <w:rStyle w:val="HTMLCode"/>
               </w:rPr>
               <w:t>SystemSettings</w:t>
             </w:r>
+            <w:proofErr w:type="spellEnd"/>
             <w:r>
               <w:rPr>
                 <w:rFonts w:ascii="Arial" w:eastAsia="Times New Roman" w:hAnsi="Arial" w:cs="Arial"/>
@@ -5837,7 +6101,27 @@
                 <w:sz w:val="18"/>
                 <w:szCs w:val="18"/>
               </w:rPr>
-              <w:t>Payment methods are enum/selection only</w:t>
+              <w:t xml:space="preserve">Payment methods are </w:t>
+            </w:r>
+            <w:proofErr w:type="spellStart"/>
+            <w:r>
+              <w:rPr>
+                <w:rFonts w:ascii="Arial" w:eastAsia="Times New Roman" w:hAnsi="Arial" w:cs="Arial"/>
+                <w:color w:val="1F2937"/>
+                <w:sz w:val="18"/>
+                <w:szCs w:val="18"/>
+              </w:rPr>
+              <w:t>enum</w:t>
+            </w:r>
+            <w:proofErr w:type="spellEnd"/>
+            <w:r>
+              <w:rPr>
+                <w:rFonts w:ascii="Arial" w:eastAsia="Times New Roman" w:hAnsi="Arial" w:cs="Arial"/>
+                <w:color w:val="1F2937"/>
+                <w:sz w:val="18"/>
+                <w:szCs w:val="18"/>
+              </w:rPr>
+              <w:t>/selection only</w:t>
             </w:r>
           </w:p>
         </w:tc>
@@ -6530,7 +6814,27 @@
                 <w:sz w:val="18"/>
                 <w:szCs w:val="18"/>
               </w:rPr>
-              <w:t>Helmet, CORS config, JWT, bcrypt, auth rate limit, body limit, admin middleware.</w:t>
+              <w:t xml:space="preserve">Helmet, CORS config, JWT, </w:t>
+            </w:r>
+            <w:proofErr w:type="spellStart"/>
+            <w:r>
+              <w:rPr>
+                <w:rFonts w:ascii="Arial" w:eastAsia="Times New Roman" w:hAnsi="Arial" w:cs="Arial"/>
+                <w:color w:val="1F2937"/>
+                <w:sz w:val="18"/>
+                <w:szCs w:val="18"/>
+              </w:rPr>
+              <w:t>bcrypt</w:t>
+            </w:r>
+            <w:proofErr w:type="spellEnd"/>
+            <w:r>
+              <w:rPr>
+                <w:rFonts w:ascii="Arial" w:eastAsia="Times New Roman" w:hAnsi="Arial" w:cs="Arial"/>
+                <w:color w:val="1F2937"/>
+                <w:sz w:val="18"/>
+                <w:szCs w:val="18"/>
+              </w:rPr>
+              <w:t>, auth rate limit, body limit, admin middleware.</w:t>
             </w:r>
           </w:p>
         </w:tc>
@@ -6956,6 +7260,7 @@
                 <w:sz w:val="18"/>
                 <w:szCs w:val="18"/>
               </w:rPr>
+              <w:lastRenderedPageBreak/>
               <w:t>Usability</w:t>
             </w:r>
           </w:p>
@@ -7050,6 +7355,7 @@
         <w:rPr>
           <w:rFonts w:ascii="Arial" w:eastAsia="Times New Roman" w:hAnsi="Arial" w:cs="Arial"/>
         </w:rPr>
+        <w:lastRenderedPageBreak/>
         <w:t>4. Technical architecture</w:t>
       </w:r>
     </w:p>
@@ -7099,16 +7405,7 @@
           <w:sz w:val="21"/>
           <w:szCs w:val="21"/>
         </w:rPr>
-        <w:t xml:space="preserve"> </w:t>
-      </w:r>
-      <w:r>
-        <w:rPr>
-          <w:rFonts w:ascii="Arial" w:eastAsia="Times New Roman" w:hAnsi="Arial" w:cs="Arial"/>
-          <w:color w:val="1F2937"/>
-          <w:sz w:val="21"/>
-          <w:szCs w:val="21"/>
-        </w:rPr>
-        <w:t>Vite serves the React SPA; React Router maps customer/admin pages; Axios attaches the stored JWT; contexts manage authentication and cart/recently viewed state.</w:t>
+        <w:t xml:space="preserve"> Vite serves the React SPA; React Router maps customer/admin pages; Axios attaches the stored JWT; contexts manage authentication and cart/recently viewed state.</w:t>
       </w:r>
     </w:p>
     <w:p>
@@ -7178,7 +7475,47 @@
           <w:sz w:val="21"/>
           <w:szCs w:val="21"/>
         </w:rPr>
-        <w:t xml:space="preserve"> MongoDB via Mongoose models: User, Product, Order, SupportTicket, SystemSettings.</w:t>
+        <w:t xml:space="preserve"> MongoDB via Mongoose models: User, Product, Order, </w:t>
+      </w:r>
+      <w:proofErr w:type="spellStart"/>
+      <w:r>
+        <w:rPr>
+          <w:rFonts w:ascii="Arial" w:eastAsia="Times New Roman" w:hAnsi="Arial" w:cs="Arial"/>
+          <w:color w:val="1F2937"/>
+          <w:sz w:val="21"/>
+          <w:szCs w:val="21"/>
+        </w:rPr>
+        <w:t>SupportTicket</w:t>
+      </w:r>
+      <w:proofErr w:type="spellEnd"/>
+      <w:r>
+        <w:rPr>
+          <w:rFonts w:ascii="Arial" w:eastAsia="Times New Roman" w:hAnsi="Arial" w:cs="Arial"/>
+          <w:color w:val="1F2937"/>
+          <w:sz w:val="21"/>
+          <w:szCs w:val="21"/>
+        </w:rPr>
+        <w:t xml:space="preserve">, </w:t>
+      </w:r>
+      <w:proofErr w:type="spellStart"/>
+      <w:r>
+        <w:rPr>
+          <w:rFonts w:ascii="Arial" w:eastAsia="Times New Roman" w:hAnsi="Arial" w:cs="Arial"/>
+          <w:color w:val="1F2937"/>
+          <w:sz w:val="21"/>
+          <w:szCs w:val="21"/>
+        </w:rPr>
+        <w:t>SystemSettings</w:t>
+      </w:r>
+      <w:proofErr w:type="spellEnd"/>
+      <w:r>
+        <w:rPr>
+          <w:rFonts w:ascii="Arial" w:eastAsia="Times New Roman" w:hAnsi="Arial" w:cs="Arial"/>
+          <w:color w:val="1F2937"/>
+          <w:sz w:val="21"/>
+          <w:szCs w:val="21"/>
+        </w:rPr>
+        <w:t>.</w:t>
       </w:r>
     </w:p>
     <w:p>
@@ -7500,8 +7837,19 @@
                 <w:sz w:val="18"/>
                 <w:szCs w:val="18"/>
               </w:rPr>
-              <w:t>name, username, email, password hash, phone, country, city, isAdmin</w:t>
-            </w:r>
+              <w:t xml:space="preserve">name, username, email, password hash, phone, country, city, </w:t>
+            </w:r>
+            <w:proofErr w:type="spellStart"/>
+            <w:r>
+              <w:rPr>
+                <w:rFonts w:ascii="Arial" w:eastAsia="Times New Roman" w:hAnsi="Arial" w:cs="Arial"/>
+                <w:color w:val="1F2937"/>
+                <w:sz w:val="18"/>
+                <w:szCs w:val="18"/>
+              </w:rPr>
+              <w:t>isAdmin</w:t>
+            </w:r>
+            <w:proofErr w:type="spellEnd"/>
           </w:p>
         </w:tc>
         <w:tc>
@@ -7616,7 +7964,27 @@
                 <w:sz w:val="18"/>
                 <w:szCs w:val="18"/>
               </w:rPr>
-              <w:t>name, category, prices, images, colours, sizes, visibility, local flag, stock, weight</w:t>
+              <w:t xml:space="preserve">name, category, prices, images, </w:t>
+            </w:r>
+            <w:proofErr w:type="spellStart"/>
+            <w:r>
+              <w:rPr>
+                <w:rFonts w:ascii="Arial" w:eastAsia="Times New Roman" w:hAnsi="Arial" w:cs="Arial"/>
+                <w:color w:val="1F2937"/>
+                <w:sz w:val="18"/>
+                <w:szCs w:val="18"/>
+              </w:rPr>
+              <w:t>colours</w:t>
+            </w:r>
+            <w:proofErr w:type="spellEnd"/>
+            <w:r>
+              <w:rPr>
+                <w:rFonts w:ascii="Arial" w:eastAsia="Times New Roman" w:hAnsi="Arial" w:cs="Arial"/>
+                <w:color w:val="1F2937"/>
+                <w:sz w:val="18"/>
+                <w:szCs w:val="18"/>
+              </w:rPr>
+              <w:t>, sizes, visibility, local flag, stock, weight</w:t>
             </w:r>
           </w:p>
         </w:tc>
@@ -7732,45 +8100,105 @@
                 <w:sz w:val="18"/>
                 <w:szCs w:val="18"/>
               </w:rPr>
-              <w:t>user, products snapshot, totals, address, paymentMethod, isPaid, status</w:t>
-            </w:r>
-          </w:p>
-        </w:tc>
-        <w:tc>
-          <w:tcPr>
-            <w:tcW w:w="0" w:type="auto"/>
-            <w:tcBorders>
-              <w:top w:val="single" w:sz="6" w:space="0" w:color="CBD5E1"/>
-              <w:left w:val="single" w:sz="6" w:space="0" w:color="CBD5E1"/>
-              <w:bottom w:val="single" w:sz="6" w:space="0" w:color="CBD5E1"/>
-              <w:right w:val="single" w:sz="6" w:space="0" w:color="CBD5E1"/>
-            </w:tcBorders>
-            <w:tcMar>
-              <w:top w:w="75" w:type="dxa"/>
-              <w:left w:w="75" w:type="dxa"/>
-              <w:bottom w:w="75" w:type="dxa"/>
-              <w:right w:w="75" w:type="dxa"/>
-            </w:tcMar>
-            <w:hideMark/>
-          </w:tcPr>
-          <w:p>
-            <w:pPr>
-              <w:spacing w:before="120" w:after="210"/>
-              <w:rPr>
-                <w:rFonts w:ascii="Arial" w:eastAsia="Times New Roman" w:hAnsi="Arial" w:cs="Arial"/>
-                <w:color w:val="1F2937"/>
-                <w:sz w:val="18"/>
-                <w:szCs w:val="18"/>
-              </w:rPr>
-            </w:pPr>
-            <w:r>
-              <w:rPr>
-                <w:rFonts w:ascii="Arial" w:eastAsia="Times New Roman" w:hAnsi="Arial" w:cs="Arial"/>
-                <w:color w:val="1F2937"/>
-                <w:sz w:val="18"/>
-                <w:szCs w:val="18"/>
-              </w:rPr>
-              <w:t>Immutable-ish purchase record and fulfillment state</w:t>
+              <w:t xml:space="preserve">user, products snapshot, totals, address, </w:t>
+            </w:r>
+            <w:proofErr w:type="spellStart"/>
+            <w:r>
+              <w:rPr>
+                <w:rFonts w:ascii="Arial" w:eastAsia="Times New Roman" w:hAnsi="Arial" w:cs="Arial"/>
+                <w:color w:val="1F2937"/>
+                <w:sz w:val="18"/>
+                <w:szCs w:val="18"/>
+              </w:rPr>
+              <w:t>paymentMethod</w:t>
+            </w:r>
+            <w:proofErr w:type="spellEnd"/>
+            <w:r>
+              <w:rPr>
+                <w:rFonts w:ascii="Arial" w:eastAsia="Times New Roman" w:hAnsi="Arial" w:cs="Arial"/>
+                <w:color w:val="1F2937"/>
+                <w:sz w:val="18"/>
+                <w:szCs w:val="18"/>
+              </w:rPr>
+              <w:t xml:space="preserve">, </w:t>
+            </w:r>
+            <w:proofErr w:type="spellStart"/>
+            <w:r>
+              <w:rPr>
+                <w:rFonts w:ascii="Arial" w:eastAsia="Times New Roman" w:hAnsi="Arial" w:cs="Arial"/>
+                <w:color w:val="1F2937"/>
+                <w:sz w:val="18"/>
+                <w:szCs w:val="18"/>
+              </w:rPr>
+              <w:t>isPaid</w:t>
+            </w:r>
+            <w:proofErr w:type="spellEnd"/>
+            <w:r>
+              <w:rPr>
+                <w:rFonts w:ascii="Arial" w:eastAsia="Times New Roman" w:hAnsi="Arial" w:cs="Arial"/>
+                <w:color w:val="1F2937"/>
+                <w:sz w:val="18"/>
+                <w:szCs w:val="18"/>
+              </w:rPr>
+              <w:t>, status</w:t>
+            </w:r>
+          </w:p>
+        </w:tc>
+        <w:tc>
+          <w:tcPr>
+            <w:tcW w:w="0" w:type="auto"/>
+            <w:tcBorders>
+              <w:top w:val="single" w:sz="6" w:space="0" w:color="CBD5E1"/>
+              <w:left w:val="single" w:sz="6" w:space="0" w:color="CBD5E1"/>
+              <w:bottom w:val="single" w:sz="6" w:space="0" w:color="CBD5E1"/>
+              <w:right w:val="single" w:sz="6" w:space="0" w:color="CBD5E1"/>
+            </w:tcBorders>
+            <w:tcMar>
+              <w:top w:w="75" w:type="dxa"/>
+              <w:left w:w="75" w:type="dxa"/>
+              <w:bottom w:w="75" w:type="dxa"/>
+              <w:right w:w="75" w:type="dxa"/>
+            </w:tcMar>
+            <w:hideMark/>
+          </w:tcPr>
+          <w:p>
+            <w:pPr>
+              <w:spacing w:before="120" w:after="210"/>
+              <w:rPr>
+                <w:rFonts w:ascii="Arial" w:eastAsia="Times New Roman" w:hAnsi="Arial" w:cs="Arial"/>
+                <w:color w:val="1F2937"/>
+                <w:sz w:val="18"/>
+                <w:szCs w:val="18"/>
+              </w:rPr>
+            </w:pPr>
+            <w:r>
+              <w:rPr>
+                <w:rFonts w:ascii="Arial" w:eastAsia="Times New Roman" w:hAnsi="Arial" w:cs="Arial"/>
+                <w:color w:val="1F2937"/>
+                <w:sz w:val="18"/>
+                <w:szCs w:val="18"/>
+              </w:rPr>
+              <w:t>Immutable-</w:t>
+            </w:r>
+            <w:proofErr w:type="spellStart"/>
+            <w:r>
+              <w:rPr>
+                <w:rFonts w:ascii="Arial" w:eastAsia="Times New Roman" w:hAnsi="Arial" w:cs="Arial"/>
+                <w:color w:val="1F2937"/>
+                <w:sz w:val="18"/>
+                <w:szCs w:val="18"/>
+              </w:rPr>
+              <w:t>ish</w:t>
+            </w:r>
+            <w:proofErr w:type="spellEnd"/>
+            <w:r>
+              <w:rPr>
+                <w:rFonts w:ascii="Arial" w:eastAsia="Times New Roman" w:hAnsi="Arial" w:cs="Arial"/>
+                <w:color w:val="1F2937"/>
+                <w:sz w:val="18"/>
+                <w:szCs w:val="18"/>
+              </w:rPr>
+              <w:t xml:space="preserve"> purchase record and fulfillment state</w:t>
             </w:r>
           </w:p>
         </w:tc>
@@ -7803,6 +8231,7 @@
                 <w:szCs w:val="18"/>
               </w:rPr>
             </w:pPr>
+            <w:proofErr w:type="spellStart"/>
             <w:r>
               <w:rPr>
                 <w:rFonts w:ascii="Arial" w:eastAsia="Times New Roman" w:hAnsi="Arial" w:cs="Arial"/>
@@ -7812,44 +8241,76 @@
               </w:rPr>
               <w:t>SupportTicket</w:t>
             </w:r>
-          </w:p>
-        </w:tc>
-        <w:tc>
-          <w:tcPr>
-            <w:tcW w:w="0" w:type="auto"/>
-            <w:tcBorders>
-              <w:top w:val="single" w:sz="6" w:space="0" w:color="CBD5E1"/>
-              <w:left w:val="single" w:sz="6" w:space="0" w:color="CBD5E1"/>
-              <w:bottom w:val="single" w:sz="6" w:space="0" w:color="CBD5E1"/>
-              <w:right w:val="single" w:sz="6" w:space="0" w:color="CBD5E1"/>
-            </w:tcBorders>
-            <w:tcMar>
-              <w:top w:w="75" w:type="dxa"/>
-              <w:left w:w="75" w:type="dxa"/>
-              <w:bottom w:w="75" w:type="dxa"/>
-              <w:right w:w="75" w:type="dxa"/>
-            </w:tcMar>
-            <w:hideMark/>
-          </w:tcPr>
-          <w:p>
-            <w:pPr>
-              <w:spacing w:before="120" w:after="210"/>
-              <w:rPr>
-                <w:rFonts w:ascii="Arial" w:eastAsia="Times New Roman" w:hAnsi="Arial" w:cs="Arial"/>
-                <w:color w:val="1F2937"/>
-                <w:sz w:val="18"/>
-                <w:szCs w:val="18"/>
-              </w:rPr>
-            </w:pPr>
-            <w:r>
-              <w:rPr>
-                <w:rFonts w:ascii="Arial" w:eastAsia="Times New Roman" w:hAnsi="Arial" w:cs="Arial"/>
-                <w:color w:val="1F2937"/>
-                <w:sz w:val="18"/>
-                <w:szCs w:val="18"/>
-              </w:rPr>
-              <w:t>user, contact data, subject, message, orderId, status, adminReply</w:t>
-            </w:r>
+            <w:proofErr w:type="spellEnd"/>
+          </w:p>
+        </w:tc>
+        <w:tc>
+          <w:tcPr>
+            <w:tcW w:w="0" w:type="auto"/>
+            <w:tcBorders>
+              <w:top w:val="single" w:sz="6" w:space="0" w:color="CBD5E1"/>
+              <w:left w:val="single" w:sz="6" w:space="0" w:color="CBD5E1"/>
+              <w:bottom w:val="single" w:sz="6" w:space="0" w:color="CBD5E1"/>
+              <w:right w:val="single" w:sz="6" w:space="0" w:color="CBD5E1"/>
+            </w:tcBorders>
+            <w:tcMar>
+              <w:top w:w="75" w:type="dxa"/>
+              <w:left w:w="75" w:type="dxa"/>
+              <w:bottom w:w="75" w:type="dxa"/>
+              <w:right w:w="75" w:type="dxa"/>
+            </w:tcMar>
+            <w:hideMark/>
+          </w:tcPr>
+          <w:p>
+            <w:pPr>
+              <w:spacing w:before="120" w:after="210"/>
+              <w:rPr>
+                <w:rFonts w:ascii="Arial" w:eastAsia="Times New Roman" w:hAnsi="Arial" w:cs="Arial"/>
+                <w:color w:val="1F2937"/>
+                <w:sz w:val="18"/>
+                <w:szCs w:val="18"/>
+              </w:rPr>
+            </w:pPr>
+            <w:r>
+              <w:rPr>
+                <w:rFonts w:ascii="Arial" w:eastAsia="Times New Roman" w:hAnsi="Arial" w:cs="Arial"/>
+                <w:color w:val="1F2937"/>
+                <w:sz w:val="18"/>
+                <w:szCs w:val="18"/>
+              </w:rPr>
+              <w:t xml:space="preserve">user, contact data, subject, message, </w:t>
+            </w:r>
+            <w:proofErr w:type="spellStart"/>
+            <w:r>
+              <w:rPr>
+                <w:rFonts w:ascii="Arial" w:eastAsia="Times New Roman" w:hAnsi="Arial" w:cs="Arial"/>
+                <w:color w:val="1F2937"/>
+                <w:sz w:val="18"/>
+                <w:szCs w:val="18"/>
+              </w:rPr>
+              <w:t>orderId</w:t>
+            </w:r>
+            <w:proofErr w:type="spellEnd"/>
+            <w:r>
+              <w:rPr>
+                <w:rFonts w:ascii="Arial" w:eastAsia="Times New Roman" w:hAnsi="Arial" w:cs="Arial"/>
+                <w:color w:val="1F2937"/>
+                <w:sz w:val="18"/>
+                <w:szCs w:val="18"/>
+              </w:rPr>
+              <w:t xml:space="preserve">, status, </w:t>
+            </w:r>
+            <w:proofErr w:type="spellStart"/>
+            <w:r>
+              <w:rPr>
+                <w:rFonts w:ascii="Arial" w:eastAsia="Times New Roman" w:hAnsi="Arial" w:cs="Arial"/>
+                <w:color w:val="1F2937"/>
+                <w:sz w:val="18"/>
+                <w:szCs w:val="18"/>
+              </w:rPr>
+              <w:t>adminReply</w:t>
+            </w:r>
+            <w:proofErr w:type="spellEnd"/>
           </w:p>
         </w:tc>
         <w:tc>
@@ -7919,6 +8380,7 @@
                 <w:szCs w:val="18"/>
               </w:rPr>
             </w:pPr>
+            <w:proofErr w:type="spellStart"/>
             <w:r>
               <w:rPr>
                 <w:rFonts w:ascii="Arial" w:eastAsia="Times New Roman" w:hAnsi="Arial" w:cs="Arial"/>
@@ -7928,6 +8390,7 @@
               </w:rPr>
               <w:t>SystemSettings</w:t>
             </w:r>
+            <w:proofErr w:type="spellEnd"/>
           </w:p>
         </w:tc>
         <w:tc>
@@ -8186,6 +8649,7 @@
               <w:rPr>
                 <w:rStyle w:val="HTMLCode"/>
               </w:rPr>
+              <w:lastRenderedPageBreak/>
               <w:t>MONGO_URI</w:t>
             </w:r>
           </w:p>
@@ -8676,8 +9140,19 @@
                 <w:sz w:val="18"/>
                 <w:szCs w:val="18"/>
               </w:rPr>
-              <w:t>frontend/.env / Docker build arg</w:t>
-            </w:r>
+              <w:t xml:space="preserve">frontend/.env / Docker build </w:t>
+            </w:r>
+            <w:proofErr w:type="spellStart"/>
+            <w:r>
+              <w:rPr>
+                <w:rFonts w:ascii="Arial" w:eastAsia="Times New Roman" w:hAnsi="Arial" w:cs="Arial"/>
+                <w:color w:val="1F2937"/>
+                <w:sz w:val="18"/>
+                <w:szCs w:val="18"/>
+              </w:rPr>
+              <w:t>arg</w:t>
+            </w:r>
+            <w:proofErr w:type="spellEnd"/>
           </w:p>
         </w:tc>
         <w:tc>
@@ -8732,6 +9207,7 @@
         <w:rPr>
           <w:rFonts w:ascii="Arial" w:eastAsia="Times New Roman" w:hAnsi="Arial" w:cs="Arial"/>
         </w:rPr>
+        <w:lastRenderedPageBreak/>
         <w:t>5. API reference</w:t>
       </w:r>
     </w:p>
@@ -8799,12 +9275,14 @@
         </w:rPr>
         <w:t xml:space="preserve">. Admin endpoints require the authenticated user’s </w:t>
       </w:r>
+      <w:proofErr w:type="spellStart"/>
       <w:r>
         <w:rPr>
           <w:rStyle w:val="HTMLCode"/>
         </w:rPr>
         <w:t>isAdmin</w:t>
       </w:r>
+      <w:proofErr w:type="spellEnd"/>
       <w:r>
         <w:rPr>
           <w:rFonts w:ascii="Arial" w:hAnsi="Arial" w:cs="Arial"/>
@@ -9330,7 +9808,27 @@
                 <w:sz w:val="18"/>
                 <w:szCs w:val="18"/>
               </w:rPr>
-              <w:t>POST /api/auth/register</w:t>
+              <w:t>POST /</w:t>
+            </w:r>
+            <w:proofErr w:type="spellStart"/>
+            <w:r>
+              <w:rPr>
+                <w:rFonts w:ascii="Arial" w:eastAsia="Times New Roman" w:hAnsi="Arial" w:cs="Arial"/>
+                <w:color w:val="1F2937"/>
+                <w:sz w:val="18"/>
+                <w:szCs w:val="18"/>
+              </w:rPr>
+              <w:t>api</w:t>
+            </w:r>
+            <w:proofErr w:type="spellEnd"/>
+            <w:r>
+              <w:rPr>
+                <w:rFonts w:ascii="Arial" w:eastAsia="Times New Roman" w:hAnsi="Arial" w:cs="Arial"/>
+                <w:color w:val="1F2937"/>
+                <w:sz w:val="18"/>
+                <w:szCs w:val="18"/>
+              </w:rPr>
+              <w:t>/auth/register</w:t>
             </w:r>
           </w:p>
         </w:tc>
@@ -9446,7 +9944,27 @@
                 <w:sz w:val="18"/>
                 <w:szCs w:val="18"/>
               </w:rPr>
-              <w:t>POST /api/auth/login</w:t>
+              <w:t>POST /</w:t>
+            </w:r>
+            <w:proofErr w:type="spellStart"/>
+            <w:r>
+              <w:rPr>
+                <w:rFonts w:ascii="Arial" w:eastAsia="Times New Roman" w:hAnsi="Arial" w:cs="Arial"/>
+                <w:color w:val="1F2937"/>
+                <w:sz w:val="18"/>
+                <w:szCs w:val="18"/>
+              </w:rPr>
+              <w:t>api</w:t>
+            </w:r>
+            <w:proofErr w:type="spellEnd"/>
+            <w:r>
+              <w:rPr>
+                <w:rFonts w:ascii="Arial" w:eastAsia="Times New Roman" w:hAnsi="Arial" w:cs="Arial"/>
+                <w:color w:val="1F2937"/>
+                <w:sz w:val="18"/>
+                <w:szCs w:val="18"/>
+              </w:rPr>
+              <w:t>/auth/login</w:t>
             </w:r>
           </w:p>
         </w:tc>
@@ -9562,7 +10080,27 @@
                 <w:sz w:val="18"/>
                 <w:szCs w:val="18"/>
               </w:rPr>
-              <w:t>GET /api/auth/profile</w:t>
+              <w:t>GET /</w:t>
+            </w:r>
+            <w:proofErr w:type="spellStart"/>
+            <w:r>
+              <w:rPr>
+                <w:rFonts w:ascii="Arial" w:eastAsia="Times New Roman" w:hAnsi="Arial" w:cs="Arial"/>
+                <w:color w:val="1F2937"/>
+                <w:sz w:val="18"/>
+                <w:szCs w:val="18"/>
+              </w:rPr>
+              <w:t>api</w:t>
+            </w:r>
+            <w:proofErr w:type="spellEnd"/>
+            <w:r>
+              <w:rPr>
+                <w:rFonts w:ascii="Arial" w:eastAsia="Times New Roman" w:hAnsi="Arial" w:cs="Arial"/>
+                <w:color w:val="1F2937"/>
+                <w:sz w:val="18"/>
+                <w:szCs w:val="18"/>
+              </w:rPr>
+              <w:t>/auth/profile</w:t>
             </w:r>
           </w:p>
         </w:tc>
@@ -9678,7 +10216,27 @@
                 <w:sz w:val="18"/>
                 <w:szCs w:val="18"/>
               </w:rPr>
-              <w:t>GET /api/auth/session</w:t>
+              <w:t>GET /</w:t>
+            </w:r>
+            <w:proofErr w:type="spellStart"/>
+            <w:r>
+              <w:rPr>
+                <w:rFonts w:ascii="Arial" w:eastAsia="Times New Roman" w:hAnsi="Arial" w:cs="Arial"/>
+                <w:color w:val="1F2937"/>
+                <w:sz w:val="18"/>
+                <w:szCs w:val="18"/>
+              </w:rPr>
+              <w:t>api</w:t>
+            </w:r>
+            <w:proofErr w:type="spellEnd"/>
+            <w:r>
+              <w:rPr>
+                <w:rFonts w:ascii="Arial" w:eastAsia="Times New Roman" w:hAnsi="Arial" w:cs="Arial"/>
+                <w:color w:val="1F2937"/>
+                <w:sz w:val="18"/>
+                <w:szCs w:val="18"/>
+              </w:rPr>
+              <w:t>/auth/session</w:t>
             </w:r>
           </w:p>
         </w:tc>
@@ -9794,7 +10352,27 @@
                 <w:sz w:val="18"/>
                 <w:szCs w:val="18"/>
               </w:rPr>
-              <w:t>GET /api/products</w:t>
+              <w:t>GET /</w:t>
+            </w:r>
+            <w:proofErr w:type="spellStart"/>
+            <w:r>
+              <w:rPr>
+                <w:rFonts w:ascii="Arial" w:eastAsia="Times New Roman" w:hAnsi="Arial" w:cs="Arial"/>
+                <w:color w:val="1F2937"/>
+                <w:sz w:val="18"/>
+                <w:szCs w:val="18"/>
+              </w:rPr>
+              <w:t>api</w:t>
+            </w:r>
+            <w:proofErr w:type="spellEnd"/>
+            <w:r>
+              <w:rPr>
+                <w:rFonts w:ascii="Arial" w:eastAsia="Times New Roman" w:hAnsi="Arial" w:cs="Arial"/>
+                <w:color w:val="1F2937"/>
+                <w:sz w:val="18"/>
+                <w:szCs w:val="18"/>
+              </w:rPr>
+              <w:t>/products</w:t>
             </w:r>
           </w:p>
         </w:tc>
@@ -9870,7 +10448,27 @@
                 <w:sz w:val="18"/>
                 <w:szCs w:val="18"/>
               </w:rPr>
-              <w:t>Visible products; optional category/isLocal filters</w:t>
+              <w:t>Visible products; optional category/</w:t>
+            </w:r>
+            <w:proofErr w:type="spellStart"/>
+            <w:r>
+              <w:rPr>
+                <w:rFonts w:ascii="Arial" w:eastAsia="Times New Roman" w:hAnsi="Arial" w:cs="Arial"/>
+                <w:color w:val="1F2937"/>
+                <w:sz w:val="18"/>
+                <w:szCs w:val="18"/>
+              </w:rPr>
+              <w:t>isLocal</w:t>
+            </w:r>
+            <w:proofErr w:type="spellEnd"/>
+            <w:r>
+              <w:rPr>
+                <w:rFonts w:ascii="Arial" w:eastAsia="Times New Roman" w:hAnsi="Arial" w:cs="Arial"/>
+                <w:color w:val="1F2937"/>
+                <w:sz w:val="18"/>
+                <w:szCs w:val="18"/>
+              </w:rPr>
+              <w:t xml:space="preserve"> filters</w:t>
             </w:r>
           </w:p>
         </w:tc>
@@ -9910,7 +10508,27 @@
                 <w:sz w:val="18"/>
                 <w:szCs w:val="18"/>
               </w:rPr>
-              <w:t>GET /api/products/categories</w:t>
+              <w:t>GET /</w:t>
+            </w:r>
+            <w:proofErr w:type="spellStart"/>
+            <w:r>
+              <w:rPr>
+                <w:rFonts w:ascii="Arial" w:eastAsia="Times New Roman" w:hAnsi="Arial" w:cs="Arial"/>
+                <w:color w:val="1F2937"/>
+                <w:sz w:val="18"/>
+                <w:szCs w:val="18"/>
+              </w:rPr>
+              <w:t>api</w:t>
+            </w:r>
+            <w:proofErr w:type="spellEnd"/>
+            <w:r>
+              <w:rPr>
+                <w:rFonts w:ascii="Arial" w:eastAsia="Times New Roman" w:hAnsi="Arial" w:cs="Arial"/>
+                <w:color w:val="1F2937"/>
+                <w:sz w:val="18"/>
+                <w:szCs w:val="18"/>
+              </w:rPr>
+              <w:t>/products/categories</w:t>
             </w:r>
           </w:p>
         </w:tc>
@@ -10026,7 +10644,27 @@
                 <w:sz w:val="18"/>
                 <w:szCs w:val="18"/>
               </w:rPr>
-              <w:t>GET /api/products/:id</w:t>
+              <w:t>GET /</w:t>
+            </w:r>
+            <w:proofErr w:type="spellStart"/>
+            <w:r>
+              <w:rPr>
+                <w:rFonts w:ascii="Arial" w:eastAsia="Times New Roman" w:hAnsi="Arial" w:cs="Arial"/>
+                <w:color w:val="1F2937"/>
+                <w:sz w:val="18"/>
+                <w:szCs w:val="18"/>
+              </w:rPr>
+              <w:t>api</w:t>
+            </w:r>
+            <w:proofErr w:type="spellEnd"/>
+            <w:r>
+              <w:rPr>
+                <w:rFonts w:ascii="Arial" w:eastAsia="Times New Roman" w:hAnsi="Arial" w:cs="Arial"/>
+                <w:color w:val="1F2937"/>
+                <w:sz w:val="18"/>
+                <w:szCs w:val="18"/>
+              </w:rPr>
+              <w:t>/products/:id</w:t>
             </w:r>
           </w:p>
         </w:tc>
@@ -10142,7 +10780,27 @@
                 <w:sz w:val="18"/>
                 <w:szCs w:val="18"/>
               </w:rPr>
-              <w:t>POST /api/products</w:t>
+              <w:t>POST /</w:t>
+            </w:r>
+            <w:proofErr w:type="spellStart"/>
+            <w:r>
+              <w:rPr>
+                <w:rFonts w:ascii="Arial" w:eastAsia="Times New Roman" w:hAnsi="Arial" w:cs="Arial"/>
+                <w:color w:val="1F2937"/>
+                <w:sz w:val="18"/>
+                <w:szCs w:val="18"/>
+              </w:rPr>
+              <w:t>api</w:t>
+            </w:r>
+            <w:proofErr w:type="spellEnd"/>
+            <w:r>
+              <w:rPr>
+                <w:rFonts w:ascii="Arial" w:eastAsia="Times New Roman" w:hAnsi="Arial" w:cs="Arial"/>
+                <w:color w:val="1F2937"/>
+                <w:sz w:val="18"/>
+                <w:szCs w:val="18"/>
+              </w:rPr>
+              <w:t>/products</w:t>
             </w:r>
           </w:p>
         </w:tc>
@@ -10258,7 +10916,27 @@
                 <w:sz w:val="18"/>
                 <w:szCs w:val="18"/>
               </w:rPr>
-              <w:t>PUT /api/products/:id</w:t>
+              <w:t>PUT /</w:t>
+            </w:r>
+            <w:proofErr w:type="spellStart"/>
+            <w:r>
+              <w:rPr>
+                <w:rFonts w:ascii="Arial" w:eastAsia="Times New Roman" w:hAnsi="Arial" w:cs="Arial"/>
+                <w:color w:val="1F2937"/>
+                <w:sz w:val="18"/>
+                <w:szCs w:val="18"/>
+              </w:rPr>
+              <w:t>api</w:t>
+            </w:r>
+            <w:proofErr w:type="spellEnd"/>
+            <w:r>
+              <w:rPr>
+                <w:rFonts w:ascii="Arial" w:eastAsia="Times New Roman" w:hAnsi="Arial" w:cs="Arial"/>
+                <w:color w:val="1F2937"/>
+                <w:sz w:val="18"/>
+                <w:szCs w:val="18"/>
+              </w:rPr>
+              <w:t>/products/:id</w:t>
             </w:r>
           </w:p>
         </w:tc>
@@ -10374,7 +11052,27 @@
                 <w:sz w:val="18"/>
                 <w:szCs w:val="18"/>
               </w:rPr>
-              <w:t>DELETE /api/products/:id</w:t>
+              <w:t>DELETE /</w:t>
+            </w:r>
+            <w:proofErr w:type="spellStart"/>
+            <w:r>
+              <w:rPr>
+                <w:rFonts w:ascii="Arial" w:eastAsia="Times New Roman" w:hAnsi="Arial" w:cs="Arial"/>
+                <w:color w:val="1F2937"/>
+                <w:sz w:val="18"/>
+                <w:szCs w:val="18"/>
+              </w:rPr>
+              <w:t>api</w:t>
+            </w:r>
+            <w:proofErr w:type="spellEnd"/>
+            <w:r>
+              <w:rPr>
+                <w:rFonts w:ascii="Arial" w:eastAsia="Times New Roman" w:hAnsi="Arial" w:cs="Arial"/>
+                <w:color w:val="1F2937"/>
+                <w:sz w:val="18"/>
+                <w:szCs w:val="18"/>
+              </w:rPr>
+              <w:t>/products/:id</w:t>
             </w:r>
           </w:p>
         </w:tc>
@@ -10490,7 +11188,27 @@
                 <w:sz w:val="18"/>
                 <w:szCs w:val="18"/>
               </w:rPr>
-              <w:t>POST /api/orders</w:t>
+              <w:t>POST /</w:t>
+            </w:r>
+            <w:proofErr w:type="spellStart"/>
+            <w:r>
+              <w:rPr>
+                <w:rFonts w:ascii="Arial" w:eastAsia="Times New Roman" w:hAnsi="Arial" w:cs="Arial"/>
+                <w:color w:val="1F2937"/>
+                <w:sz w:val="18"/>
+                <w:szCs w:val="18"/>
+              </w:rPr>
+              <w:t>api</w:t>
+            </w:r>
+            <w:proofErr w:type="spellEnd"/>
+            <w:r>
+              <w:rPr>
+                <w:rFonts w:ascii="Arial" w:eastAsia="Times New Roman" w:hAnsi="Arial" w:cs="Arial"/>
+                <w:color w:val="1F2937"/>
+                <w:sz w:val="18"/>
+                <w:szCs w:val="18"/>
+              </w:rPr>
+              <w:t>/orders</w:t>
             </w:r>
           </w:p>
         </w:tc>
@@ -10606,7 +11324,28 @@
                 <w:sz w:val="18"/>
                 <w:szCs w:val="18"/>
               </w:rPr>
-              <w:t>GET /api/orders/my</w:t>
+              <w:lastRenderedPageBreak/>
+              <w:t>GET /</w:t>
+            </w:r>
+            <w:proofErr w:type="spellStart"/>
+            <w:r>
+              <w:rPr>
+                <w:rFonts w:ascii="Arial" w:eastAsia="Times New Roman" w:hAnsi="Arial" w:cs="Arial"/>
+                <w:color w:val="1F2937"/>
+                <w:sz w:val="18"/>
+                <w:szCs w:val="18"/>
+              </w:rPr>
+              <w:t>api</w:t>
+            </w:r>
+            <w:proofErr w:type="spellEnd"/>
+            <w:r>
+              <w:rPr>
+                <w:rFonts w:ascii="Arial" w:eastAsia="Times New Roman" w:hAnsi="Arial" w:cs="Arial"/>
+                <w:color w:val="1F2937"/>
+                <w:sz w:val="18"/>
+                <w:szCs w:val="18"/>
+              </w:rPr>
+              <w:t>/orders/my</w:t>
             </w:r>
           </w:p>
         </w:tc>
@@ -10722,7 +11461,27 @@
                 <w:sz w:val="18"/>
                 <w:szCs w:val="18"/>
               </w:rPr>
-              <w:t>GET /api/orders/:id</w:t>
+              <w:t>GET /</w:t>
+            </w:r>
+            <w:proofErr w:type="spellStart"/>
+            <w:r>
+              <w:rPr>
+                <w:rFonts w:ascii="Arial" w:eastAsia="Times New Roman" w:hAnsi="Arial" w:cs="Arial"/>
+                <w:color w:val="1F2937"/>
+                <w:sz w:val="18"/>
+                <w:szCs w:val="18"/>
+              </w:rPr>
+              <w:t>api</w:t>
+            </w:r>
+            <w:proofErr w:type="spellEnd"/>
+            <w:r>
+              <w:rPr>
+                <w:rFonts w:ascii="Arial" w:eastAsia="Times New Roman" w:hAnsi="Arial" w:cs="Arial"/>
+                <w:color w:val="1F2937"/>
+                <w:sz w:val="18"/>
+                <w:szCs w:val="18"/>
+              </w:rPr>
+              <w:t>/orders/:id</w:t>
             </w:r>
           </w:p>
         </w:tc>
@@ -10838,7 +11597,27 @@
                 <w:sz w:val="18"/>
                 <w:szCs w:val="18"/>
               </w:rPr>
-              <w:t>GET /api/orders</w:t>
+              <w:t>GET /</w:t>
+            </w:r>
+            <w:proofErr w:type="spellStart"/>
+            <w:r>
+              <w:rPr>
+                <w:rFonts w:ascii="Arial" w:eastAsia="Times New Roman" w:hAnsi="Arial" w:cs="Arial"/>
+                <w:color w:val="1F2937"/>
+                <w:sz w:val="18"/>
+                <w:szCs w:val="18"/>
+              </w:rPr>
+              <w:t>api</w:t>
+            </w:r>
+            <w:proofErr w:type="spellEnd"/>
+            <w:r>
+              <w:rPr>
+                <w:rFonts w:ascii="Arial" w:eastAsia="Times New Roman" w:hAnsi="Arial" w:cs="Arial"/>
+                <w:color w:val="1F2937"/>
+                <w:sz w:val="18"/>
+                <w:szCs w:val="18"/>
+              </w:rPr>
+              <w:t>/orders</w:t>
             </w:r>
           </w:p>
         </w:tc>
@@ -10954,7 +11733,27 @@
                 <w:sz w:val="18"/>
                 <w:szCs w:val="18"/>
               </w:rPr>
-              <w:t>PUT /api/orders/:id/status</w:t>
+              <w:t>PUT /</w:t>
+            </w:r>
+            <w:proofErr w:type="spellStart"/>
+            <w:r>
+              <w:rPr>
+                <w:rFonts w:ascii="Arial" w:eastAsia="Times New Roman" w:hAnsi="Arial" w:cs="Arial"/>
+                <w:color w:val="1F2937"/>
+                <w:sz w:val="18"/>
+                <w:szCs w:val="18"/>
+              </w:rPr>
+              <w:t>api</w:t>
+            </w:r>
+            <w:proofErr w:type="spellEnd"/>
+            <w:r>
+              <w:rPr>
+                <w:rFonts w:ascii="Arial" w:eastAsia="Times New Roman" w:hAnsi="Arial" w:cs="Arial"/>
+                <w:color w:val="1F2937"/>
+                <w:sz w:val="18"/>
+                <w:szCs w:val="18"/>
+              </w:rPr>
+              <w:t>/orders/:id/status</w:t>
             </w:r>
           </w:p>
         </w:tc>
@@ -11070,7 +11869,27 @@
                 <w:sz w:val="18"/>
                 <w:szCs w:val="18"/>
               </w:rPr>
-              <w:t>POST /api/support/tickets</w:t>
+              <w:t>POST /</w:t>
+            </w:r>
+            <w:proofErr w:type="spellStart"/>
+            <w:r>
+              <w:rPr>
+                <w:rFonts w:ascii="Arial" w:eastAsia="Times New Roman" w:hAnsi="Arial" w:cs="Arial"/>
+                <w:color w:val="1F2937"/>
+                <w:sz w:val="18"/>
+                <w:szCs w:val="18"/>
+              </w:rPr>
+              <w:t>api</w:t>
+            </w:r>
+            <w:proofErr w:type="spellEnd"/>
+            <w:r>
+              <w:rPr>
+                <w:rFonts w:ascii="Arial" w:eastAsia="Times New Roman" w:hAnsi="Arial" w:cs="Arial"/>
+                <w:color w:val="1F2937"/>
+                <w:sz w:val="18"/>
+                <w:szCs w:val="18"/>
+              </w:rPr>
+              <w:t>/support/tickets</w:t>
             </w:r>
           </w:p>
         </w:tc>
@@ -11186,7 +12005,27 @@
                 <w:sz w:val="18"/>
                 <w:szCs w:val="18"/>
               </w:rPr>
-              <w:t>POST /api/support/tickets/guest</w:t>
+              <w:t>POST /</w:t>
+            </w:r>
+            <w:proofErr w:type="spellStart"/>
+            <w:r>
+              <w:rPr>
+                <w:rFonts w:ascii="Arial" w:eastAsia="Times New Roman" w:hAnsi="Arial" w:cs="Arial"/>
+                <w:color w:val="1F2937"/>
+                <w:sz w:val="18"/>
+                <w:szCs w:val="18"/>
+              </w:rPr>
+              <w:t>api</w:t>
+            </w:r>
+            <w:proofErr w:type="spellEnd"/>
+            <w:r>
+              <w:rPr>
+                <w:rFonts w:ascii="Arial" w:eastAsia="Times New Roman" w:hAnsi="Arial" w:cs="Arial"/>
+                <w:color w:val="1F2937"/>
+                <w:sz w:val="18"/>
+                <w:szCs w:val="18"/>
+              </w:rPr>
+              <w:t>/support/tickets/guest</w:t>
             </w:r>
           </w:p>
         </w:tc>
@@ -11302,7 +12141,27 @@
                 <w:sz w:val="18"/>
                 <w:szCs w:val="18"/>
               </w:rPr>
-              <w:t>GET /api/support/tickets/my</w:t>
+              <w:t>GET /</w:t>
+            </w:r>
+            <w:proofErr w:type="spellStart"/>
+            <w:r>
+              <w:rPr>
+                <w:rFonts w:ascii="Arial" w:eastAsia="Times New Roman" w:hAnsi="Arial" w:cs="Arial"/>
+                <w:color w:val="1F2937"/>
+                <w:sz w:val="18"/>
+                <w:szCs w:val="18"/>
+              </w:rPr>
+              <w:t>api</w:t>
+            </w:r>
+            <w:proofErr w:type="spellEnd"/>
+            <w:r>
+              <w:rPr>
+                <w:rFonts w:ascii="Arial" w:eastAsia="Times New Roman" w:hAnsi="Arial" w:cs="Arial"/>
+                <w:color w:val="1F2937"/>
+                <w:sz w:val="18"/>
+                <w:szCs w:val="18"/>
+              </w:rPr>
+              <w:t>/support/tickets/my</w:t>
             </w:r>
           </w:p>
         </w:tc>
@@ -11418,7 +12277,27 @@
                 <w:sz w:val="18"/>
                 <w:szCs w:val="18"/>
               </w:rPr>
-              <w:t>GET /api/support/tickets</w:t>
+              <w:t>GET /</w:t>
+            </w:r>
+            <w:proofErr w:type="spellStart"/>
+            <w:r>
+              <w:rPr>
+                <w:rFonts w:ascii="Arial" w:eastAsia="Times New Roman" w:hAnsi="Arial" w:cs="Arial"/>
+                <w:color w:val="1F2937"/>
+                <w:sz w:val="18"/>
+                <w:szCs w:val="18"/>
+              </w:rPr>
+              <w:t>api</w:t>
+            </w:r>
+            <w:proofErr w:type="spellEnd"/>
+            <w:r>
+              <w:rPr>
+                <w:rFonts w:ascii="Arial" w:eastAsia="Times New Roman" w:hAnsi="Arial" w:cs="Arial"/>
+                <w:color w:val="1F2937"/>
+                <w:sz w:val="18"/>
+                <w:szCs w:val="18"/>
+              </w:rPr>
+              <w:t>/support/tickets</w:t>
             </w:r>
           </w:p>
         </w:tc>
@@ -11534,7 +12413,27 @@
                 <w:sz w:val="18"/>
                 <w:szCs w:val="18"/>
               </w:rPr>
-              <w:t>PUT /api/support/tickets/:id/status</w:t>
+              <w:t>PUT /</w:t>
+            </w:r>
+            <w:proofErr w:type="spellStart"/>
+            <w:r>
+              <w:rPr>
+                <w:rFonts w:ascii="Arial" w:eastAsia="Times New Roman" w:hAnsi="Arial" w:cs="Arial"/>
+                <w:color w:val="1F2937"/>
+                <w:sz w:val="18"/>
+                <w:szCs w:val="18"/>
+              </w:rPr>
+              <w:t>api</w:t>
+            </w:r>
+            <w:proofErr w:type="spellEnd"/>
+            <w:r>
+              <w:rPr>
+                <w:rFonts w:ascii="Arial" w:eastAsia="Times New Roman" w:hAnsi="Arial" w:cs="Arial"/>
+                <w:color w:val="1F2937"/>
+                <w:sz w:val="18"/>
+                <w:szCs w:val="18"/>
+              </w:rPr>
+              <w:t>/support/tickets/:id/status</w:t>
             </w:r>
           </w:p>
         </w:tc>
@@ -11650,7 +12549,27 @@
                 <w:sz w:val="18"/>
                 <w:szCs w:val="18"/>
               </w:rPr>
-              <w:t>PUT /api/support/tickets/:id/reply</w:t>
+              <w:t>PUT /</w:t>
+            </w:r>
+            <w:proofErr w:type="spellStart"/>
+            <w:r>
+              <w:rPr>
+                <w:rFonts w:ascii="Arial" w:eastAsia="Times New Roman" w:hAnsi="Arial" w:cs="Arial"/>
+                <w:color w:val="1F2937"/>
+                <w:sz w:val="18"/>
+                <w:szCs w:val="18"/>
+              </w:rPr>
+              <w:t>api</w:t>
+            </w:r>
+            <w:proofErr w:type="spellEnd"/>
+            <w:r>
+              <w:rPr>
+                <w:rFonts w:ascii="Arial" w:eastAsia="Times New Roman" w:hAnsi="Arial" w:cs="Arial"/>
+                <w:color w:val="1F2937"/>
+                <w:sz w:val="18"/>
+                <w:szCs w:val="18"/>
+              </w:rPr>
+              <w:t>/support/tickets/:id/reply</w:t>
             </w:r>
           </w:p>
         </w:tc>
@@ -11766,7 +12685,27 @@
                 <w:sz w:val="18"/>
                 <w:szCs w:val="18"/>
               </w:rPr>
-              <w:t>GET /api/settings/public</w:t>
+              <w:t>GET /</w:t>
+            </w:r>
+            <w:proofErr w:type="spellStart"/>
+            <w:r>
+              <w:rPr>
+                <w:rFonts w:ascii="Arial" w:eastAsia="Times New Roman" w:hAnsi="Arial" w:cs="Arial"/>
+                <w:color w:val="1F2937"/>
+                <w:sz w:val="18"/>
+                <w:szCs w:val="18"/>
+              </w:rPr>
+              <w:t>api</w:t>
+            </w:r>
+            <w:proofErr w:type="spellEnd"/>
+            <w:r>
+              <w:rPr>
+                <w:rFonts w:ascii="Arial" w:eastAsia="Times New Roman" w:hAnsi="Arial" w:cs="Arial"/>
+                <w:color w:val="1F2937"/>
+                <w:sz w:val="18"/>
+                <w:szCs w:val="18"/>
+              </w:rPr>
+              <w:t>/settings/public</w:t>
             </w:r>
           </w:p>
         </w:tc>
@@ -11882,7 +12821,27 @@
                 <w:sz w:val="18"/>
                 <w:szCs w:val="18"/>
               </w:rPr>
-              <w:t>GET /api/settings</w:t>
+              <w:t>GET /</w:t>
+            </w:r>
+            <w:proofErr w:type="spellStart"/>
+            <w:r>
+              <w:rPr>
+                <w:rFonts w:ascii="Arial" w:eastAsia="Times New Roman" w:hAnsi="Arial" w:cs="Arial"/>
+                <w:color w:val="1F2937"/>
+                <w:sz w:val="18"/>
+                <w:szCs w:val="18"/>
+              </w:rPr>
+              <w:t>api</w:t>
+            </w:r>
+            <w:proofErr w:type="spellEnd"/>
+            <w:r>
+              <w:rPr>
+                <w:rFonts w:ascii="Arial" w:eastAsia="Times New Roman" w:hAnsi="Arial" w:cs="Arial"/>
+                <w:color w:val="1F2937"/>
+                <w:sz w:val="18"/>
+                <w:szCs w:val="18"/>
+              </w:rPr>
+              <w:t>/settings</w:t>
             </w:r>
           </w:p>
         </w:tc>
@@ -11998,7 +12957,27 @@
                 <w:sz w:val="18"/>
                 <w:szCs w:val="18"/>
               </w:rPr>
-              <w:t>PUT /api/settings</w:t>
+              <w:t>PUT /</w:t>
+            </w:r>
+            <w:proofErr w:type="spellStart"/>
+            <w:r>
+              <w:rPr>
+                <w:rFonts w:ascii="Arial" w:eastAsia="Times New Roman" w:hAnsi="Arial" w:cs="Arial"/>
+                <w:color w:val="1F2937"/>
+                <w:sz w:val="18"/>
+                <w:szCs w:val="18"/>
+              </w:rPr>
+              <w:t>api</w:t>
+            </w:r>
+            <w:proofErr w:type="spellEnd"/>
+            <w:r>
+              <w:rPr>
+                <w:rFonts w:ascii="Arial" w:eastAsia="Times New Roman" w:hAnsi="Arial" w:cs="Arial"/>
+                <w:color w:val="1F2937"/>
+                <w:sz w:val="18"/>
+                <w:szCs w:val="18"/>
+              </w:rPr>
+              <w:t>/settings</w:t>
             </w:r>
           </w:p>
         </w:tc>
@@ -12110,7 +13089,67 @@
           <w:sz w:val="21"/>
           <w:szCs w:val="21"/>
         </w:rPr>
-        <w:t xml:space="preserve"> the accepted payment enum includes COD, JazzCash, EasyPaisa, Stripe, and PayPal, but only COD behavior is implemented. Non-COD methods are currently order metadata, not completed payment transactions.</w:t>
+        <w:t xml:space="preserve"> the accepted payment </w:t>
+      </w:r>
+      <w:proofErr w:type="spellStart"/>
+      <w:r>
+        <w:rPr>
+          <w:rFonts w:ascii="Arial" w:eastAsia="Times New Roman" w:hAnsi="Arial" w:cs="Arial"/>
+          <w:color w:val="1F2937"/>
+          <w:sz w:val="21"/>
+          <w:szCs w:val="21"/>
+        </w:rPr>
+        <w:t>enum</w:t>
+      </w:r>
+      <w:proofErr w:type="spellEnd"/>
+      <w:r>
+        <w:rPr>
+          <w:rFonts w:ascii="Arial" w:eastAsia="Times New Roman" w:hAnsi="Arial" w:cs="Arial"/>
+          <w:color w:val="1F2937"/>
+          <w:sz w:val="21"/>
+          <w:szCs w:val="21"/>
+        </w:rPr>
+        <w:t xml:space="preserve"> includes COD, </w:t>
+      </w:r>
+      <w:proofErr w:type="spellStart"/>
+      <w:r>
+        <w:rPr>
+          <w:rFonts w:ascii="Arial" w:eastAsia="Times New Roman" w:hAnsi="Arial" w:cs="Arial"/>
+          <w:color w:val="1F2937"/>
+          <w:sz w:val="21"/>
+          <w:szCs w:val="21"/>
+        </w:rPr>
+        <w:t>JazzCash</w:t>
+      </w:r>
+      <w:proofErr w:type="spellEnd"/>
+      <w:r>
+        <w:rPr>
+          <w:rFonts w:ascii="Arial" w:eastAsia="Times New Roman" w:hAnsi="Arial" w:cs="Arial"/>
+          <w:color w:val="1F2937"/>
+          <w:sz w:val="21"/>
+          <w:szCs w:val="21"/>
+        </w:rPr>
+        <w:t xml:space="preserve">, </w:t>
+      </w:r>
+      <w:proofErr w:type="spellStart"/>
+      <w:r>
+        <w:rPr>
+          <w:rFonts w:ascii="Arial" w:eastAsia="Times New Roman" w:hAnsi="Arial" w:cs="Arial"/>
+          <w:color w:val="1F2937"/>
+          <w:sz w:val="21"/>
+          <w:szCs w:val="21"/>
+        </w:rPr>
+        <w:t>EasyPaisa</w:t>
+      </w:r>
+      <w:proofErr w:type="spellEnd"/>
+      <w:r>
+        <w:rPr>
+          <w:rFonts w:ascii="Arial" w:eastAsia="Times New Roman" w:hAnsi="Arial" w:cs="Arial"/>
+          <w:color w:val="1F2937"/>
+          <w:sz w:val="21"/>
+          <w:szCs w:val="21"/>
+        </w:rPr>
+        <w:t>, Stripe, and PayPal, but only COD behavior is implemented. Non-COD methods are currently order metadata, not completed payment transactions.</w:t>
       </w:r>
     </w:p>
     <w:p>
@@ -12125,6 +13164,7 @@
         <w:rPr>
           <w:rFonts w:ascii="Arial" w:eastAsia="Times New Roman" w:hAnsi="Arial" w:cs="Arial"/>
         </w:rPr>
+        <w:lastRenderedPageBreak/>
         <w:t>6. Deployment and operations</w:t>
       </w:r>
     </w:p>
@@ -12163,7 +13203,27 @@
           <w:sz w:val="21"/>
           <w:szCs w:val="21"/>
         </w:rPr>
-        <w:t>Install Node.js LTS, npm, and MongoDB or use Docker Desktop.</w:t>
+        <w:t xml:space="preserve">Install Node.js LTS, </w:t>
+      </w:r>
+      <w:proofErr w:type="spellStart"/>
+      <w:r>
+        <w:rPr>
+          <w:rFonts w:ascii="Arial" w:eastAsia="Times New Roman" w:hAnsi="Arial" w:cs="Arial"/>
+          <w:color w:val="1F2937"/>
+          <w:sz w:val="21"/>
+          <w:szCs w:val="21"/>
+        </w:rPr>
+        <w:t>npm</w:t>
+      </w:r>
+      <w:proofErr w:type="spellEnd"/>
+      <w:r>
+        <w:rPr>
+          <w:rFonts w:ascii="Arial" w:eastAsia="Times New Roman" w:hAnsi="Arial" w:cs="Arial"/>
+          <w:color w:val="1F2937"/>
+          <w:sz w:val="21"/>
+          <w:szCs w:val="21"/>
+        </w:rPr>
+        <w:t>, and MongoDB or use Docker Desktop.</w:t>
       </w:r>
     </w:p>
     <w:p>
@@ -12464,16 +13524,7 @@
           <w:sz w:val="21"/>
           <w:szCs w:val="21"/>
         </w:rPr>
-        <w:t xml:space="preserve"> </w:t>
-      </w:r>
-      <w:r>
-        <w:rPr>
-          <w:rFonts w:ascii="Arial" w:hAnsi="Arial" w:cs="Arial"/>
-          <w:color w:val="1F2937"/>
-          <w:sz w:val="21"/>
-          <w:szCs w:val="21"/>
-        </w:rPr>
-        <w:t>starts MongoDB, backend on port 5000, and Nginx frontend on port 3000. Named volumes persist MongoDB data and uploads. Avoid deleting volumes unless data loss is intended.</w:t>
+        <w:t xml:space="preserve"> starts MongoDB, backend on port 5000, and Nginx frontend on port 3000. Named volumes persist MongoDB data and uploads. Avoid deleting volumes unless data loss is intended.</w:t>
       </w:r>
     </w:p>
     <w:p>
@@ -12543,12 +13594,14 @@
         </w:rPr>
         <w:t xml:space="preserve">MongoDB Database Tools are required for the included </w:t>
       </w:r>
+      <w:proofErr w:type="spellStart"/>
       <w:r>
         <w:rPr>
           <w:rStyle w:val="HTMLCode"/>
         </w:rPr>
         <w:t>db:backup</w:t>
       </w:r>
+      <w:proofErr w:type="spellEnd"/>
       <w:r>
         <w:rPr>
           <w:rFonts w:ascii="Arial" w:hAnsi="Arial" w:cs="Arial"/>
@@ -12558,12 +13611,14 @@
         </w:rPr>
         <w:t xml:space="preserve"> and </w:t>
       </w:r>
+      <w:proofErr w:type="spellStart"/>
       <w:r>
         <w:rPr>
           <w:rStyle w:val="HTMLCode"/>
         </w:rPr>
         <w:t>db:restore</w:t>
       </w:r>
+      <w:proofErr w:type="spellEnd"/>
       <w:r>
         <w:rPr>
           <w:rFonts w:ascii="Arial" w:hAnsi="Arial" w:cs="Arial"/>
@@ -12729,6 +13784,7 @@
           <w:sz w:val="21"/>
           <w:szCs w:val="21"/>
         </w:rPr>
+        <w:lastRenderedPageBreak/>
         <w:t>Finalize and publish privacy, terms, returns, contact, business identity, retention, and jurisdiction details.</w:t>
       </w:r>
     </w:p>
@@ -12744,6 +13800,7 @@
         <w:rPr>
           <w:rFonts w:ascii="Arial" w:eastAsia="Times New Roman" w:hAnsi="Arial" w:cs="Arial"/>
         </w:rPr>
+        <w:lastRenderedPageBreak/>
         <w:t>7. Remaining work and recommended roadmap</w:t>
       </w:r>
     </w:p>
@@ -14034,7 +15091,27 @@
                 <w:sz w:val="18"/>
                 <w:szCs w:val="18"/>
               </w:rPr>
-              <w:t>Reviews, wishlist, coupons, abandoned-cart recovery, vendor tools, and advanced reporting if business requires them.</w:t>
+              <w:t xml:space="preserve">Reviews, </w:t>
+            </w:r>
+            <w:proofErr w:type="spellStart"/>
+            <w:r>
+              <w:rPr>
+                <w:rFonts w:ascii="Arial" w:eastAsia="Times New Roman" w:hAnsi="Arial" w:cs="Arial"/>
+                <w:color w:val="1F2937"/>
+                <w:sz w:val="18"/>
+                <w:szCs w:val="18"/>
+              </w:rPr>
+              <w:t>wishlist</w:t>
+            </w:r>
+            <w:proofErr w:type="spellEnd"/>
+            <w:r>
+              <w:rPr>
+                <w:rFonts w:ascii="Arial" w:eastAsia="Times New Roman" w:hAnsi="Arial" w:cs="Arial"/>
+                <w:color w:val="1F2937"/>
+                <w:sz w:val="18"/>
+                <w:szCs w:val="18"/>
+              </w:rPr>
+              <w:t>, coupons, abandoned-cart recovery, vendor tools, and advanced reporting if business requires them.</w:t>
             </w:r>
           </w:p>
         </w:tc>
@@ -14075,6 +15152,7 @@
           <w:sz w:val="21"/>
           <w:szCs w:val="21"/>
         </w:rPr>
+        <w:lastRenderedPageBreak/>
         <w:t xml:space="preserve">The Support FAQ text states simplified shipping values that do not match the current zone-based defaults in </w:t>
       </w:r>
       <w:r>
@@ -14122,12 +15200,14 @@
           <w:szCs w:val="21"/>
         </w:rPr>
       </w:pPr>
+      <w:proofErr w:type="spellStart"/>
       <w:r>
         <w:rPr>
           <w:rStyle w:val="HTMLCode"/>
         </w:rPr>
         <w:t>AdminPage.jsx</w:t>
       </w:r>
+      <w:proofErr w:type="spellEnd"/>
       <w:r>
         <w:rPr>
           <w:rFonts w:ascii="Arial" w:eastAsia="Times New Roman" w:hAnsi="Arial" w:cs="Arial"/>
@@ -14137,12 +15217,14 @@
         </w:rPr>
         <w:t xml:space="preserve"> contains legacy local-storage support helpers while the dedicated </w:t>
       </w:r>
+      <w:proofErr w:type="spellStart"/>
       <w:r>
         <w:rPr>
           <w:rStyle w:val="HTMLCode"/>
         </w:rPr>
         <w:t>SupportPage.jsx</w:t>
       </w:r>
+      <w:proofErr w:type="spellEnd"/>
       <w:r>
         <w:rPr>
           <w:rFonts w:ascii="Arial" w:eastAsia="Times New Roman" w:hAnsi="Arial" w:cs="Arial"/>
@@ -14213,6 +15295,7 @@
         <w:rPr>
           <w:rFonts w:ascii="Arial" w:eastAsia="Times New Roman" w:hAnsi="Arial" w:cs="Arial"/>
         </w:rPr>
+        <w:lastRenderedPageBreak/>
         <w:t>8. Existing documentation inventory</w:t>
       </w:r>
     </w:p>
@@ -15408,16 +16491,7 @@
           <w:sz w:val="21"/>
           <w:szCs w:val="21"/>
         </w:rPr>
-        <w:t xml:space="preserve"> </w:t>
-      </w:r>
-      <w:r>
-        <w:rPr>
-          <w:rFonts w:ascii="Arial" w:hAnsi="Arial" w:cs="Arial"/>
-          <w:color w:val="1F2937"/>
-          <w:sz w:val="21"/>
-          <w:szCs w:val="21"/>
-        </w:rPr>
-        <w:t>The core MVP is implemented and verified by syntax/tests/build, but payment settlement, courier execution, legal completion, production operations, and several customer-service capabilities remain. The application is suitable for controlled internal/demo use and further integration work.</w:t>
+        <w:t xml:space="preserve"> The core MVP is implemented and verified by syntax/tests/build, but payment settlement, courier execution, legal completion, production operations, and several customer-service capabilities remain. The application is suitable for controlled internal/demo use and further integration work.</w:t>
       </w:r>
     </w:p>
     <w:p>
@@ -15432,7 +16506,183 @@
         <w:rPr>
           <w:rFonts w:ascii="Arial" w:hAnsi="Arial" w:cs="Arial"/>
         </w:rPr>
-        <w:t>End of consolidated IndusCart documentation.</w:t>
+        <w:t xml:space="preserve">End of consolidated </w:t>
+      </w:r>
+      <w:proofErr w:type="spellStart"/>
+      <w:r>
+        <w:rPr>
+          <w:rFonts w:ascii="Arial" w:hAnsi="Arial" w:cs="Arial"/>
+        </w:rPr>
+        <w:t>IndusCart</w:t>
+      </w:r>
+      <w:proofErr w:type="spellEnd"/>
+      <w:r>
+        <w:rPr>
+          <w:rFonts w:ascii="Arial" w:hAnsi="Arial" w:cs="Arial"/>
+        </w:rPr>
+        <w:t xml:space="preserve"> documentation.</w:t>
+      </w:r>
+    </w:p>
+    <w:p>
+      <w:pPr>
+        <w:pStyle w:val="small"/>
+        <w:spacing w:before="90" w:after="90"/>
+        <w:rPr>
+          <w:rFonts w:ascii="Arial" w:hAnsi="Arial" w:cs="Arial"/>
+        </w:rPr>
+      </w:pPr>
+      <w:r>
+        <w:rPr>
+          <w:rFonts w:ascii="Arial" w:hAnsi="Arial" w:cs="Arial"/>
+        </w:rPr>
+        <w:t>git add -A</w:t>
+      </w:r>
+    </w:p>
+    <w:p>
+      <w:pPr>
+        <w:pStyle w:val="small"/>
+        <w:spacing w:before="90" w:after="90"/>
+        <w:rPr>
+          <w:rFonts w:ascii="Arial" w:hAnsi="Arial" w:cs="Arial"/>
+        </w:rPr>
+      </w:pPr>
+      <w:r>
+        <w:rPr>
+          <w:rFonts w:ascii="Arial" w:hAnsi="Arial" w:cs="Arial"/>
+        </w:rPr>
+        <w:t>git commit -m "add complete project documentation"</w:t>
+      </w:r>
+    </w:p>
+    <w:p>
+      <w:pPr>
+        <w:pStyle w:val="small"/>
+        <w:spacing w:before="90" w:after="90"/>
+        <w:rPr>
+          <w:rFonts w:ascii="Arial" w:hAnsi="Arial" w:cs="Arial"/>
+        </w:rPr>
+      </w:pPr>
+      <w:r>
+        <w:rPr>
+          <w:rFonts w:ascii="Arial" w:hAnsi="Arial" w:cs="Arial"/>
+        </w:rPr>
+        <w:t xml:space="preserve">git push origin </w:t>
+      </w:r>
+      <w:proofErr w:type="spellStart"/>
+      <w:r>
+        <w:rPr>
+          <w:rFonts w:ascii="Arial" w:hAnsi="Arial" w:cs="Arial"/>
+        </w:rPr>
+        <w:t>qa</w:t>
+      </w:r>
+      <w:proofErr w:type="spellEnd"/>
+      <w:r>
+        <w:rPr>
+          <w:rFonts w:ascii="Arial" w:hAnsi="Arial" w:cs="Arial"/>
+        </w:rPr>
+        <w:t>/</w:t>
+      </w:r>
+      <w:proofErr w:type="spellStart"/>
+      <w:r>
+        <w:rPr>
+          <w:rFonts w:ascii="Arial" w:hAnsi="Arial" w:cs="Arial"/>
+        </w:rPr>
+        <w:t>induscart</w:t>
+      </w:r>
+      <w:proofErr w:type="spellEnd"/>
+      <w:r>
+        <w:rPr>
+          <w:rFonts w:ascii="Arial" w:hAnsi="Arial" w:cs="Arial"/>
+        </w:rPr>
+        <w:t>-testing</w:t>
+      </w:r>
+    </w:p>
+    <w:p>
+      <w:pPr>
+        <w:pStyle w:val="small"/>
+        <w:spacing w:before="90" w:after="90"/>
+        <w:rPr>
+          <w:rFonts w:ascii="Arial" w:hAnsi="Arial" w:cs="Arial"/>
+        </w:rPr>
+      </w:pPr>
+      <w:r>
+        <w:rPr>
+          <w:rFonts w:ascii="Arial" w:hAnsi="Arial" w:cs="Arial"/>
+        </w:rPr>
+        <w:lastRenderedPageBreak/>
+        <w:t>git checkout main</w:t>
+      </w:r>
+    </w:p>
+    <w:p>
+      <w:pPr>
+        <w:pStyle w:val="small"/>
+        <w:spacing w:before="90" w:after="90"/>
+        <w:rPr>
+          <w:rFonts w:ascii="Arial" w:hAnsi="Arial" w:cs="Arial"/>
+        </w:rPr>
+      </w:pPr>
+      <w:r>
+        <w:rPr>
+          <w:rFonts w:ascii="Arial" w:hAnsi="Arial" w:cs="Arial"/>
+        </w:rPr>
+        <w:t>git pull origin main</w:t>
+      </w:r>
+    </w:p>
+    <w:p>
+      <w:pPr>
+        <w:pStyle w:val="small"/>
+        <w:spacing w:before="90" w:after="90"/>
+        <w:rPr>
+          <w:rFonts w:ascii="Arial" w:hAnsi="Arial" w:cs="Arial"/>
+        </w:rPr>
+      </w:pPr>
+      <w:r>
+        <w:rPr>
+          <w:rFonts w:ascii="Arial" w:hAnsi="Arial" w:cs="Arial"/>
+        </w:rPr>
+        <w:t xml:space="preserve">git merge --no-ff </w:t>
+      </w:r>
+      <w:proofErr w:type="spellStart"/>
+      <w:r>
+        <w:rPr>
+          <w:rFonts w:ascii="Arial" w:hAnsi="Arial" w:cs="Arial"/>
+        </w:rPr>
+        <w:t>qa</w:t>
+      </w:r>
+      <w:proofErr w:type="spellEnd"/>
+      <w:r>
+        <w:rPr>
+          <w:rFonts w:ascii="Arial" w:hAnsi="Arial" w:cs="Arial"/>
+        </w:rPr>
+        <w:t>/</w:t>
+      </w:r>
+      <w:proofErr w:type="spellStart"/>
+      <w:r>
+        <w:rPr>
+          <w:rFonts w:ascii="Arial" w:hAnsi="Arial" w:cs="Arial"/>
+        </w:rPr>
+        <w:t>induscart</w:t>
+      </w:r>
+      <w:proofErr w:type="spellEnd"/>
+      <w:r>
+        <w:rPr>
+          <w:rFonts w:ascii="Arial" w:hAnsi="Arial" w:cs="Arial"/>
+        </w:rPr>
+        <w:t>-testing -m "merge complete project documentation"</w:t>
+      </w:r>
+    </w:p>
+    <w:p>
+      <w:pPr>
+        <w:pStyle w:val="small"/>
+        <w:spacing w:before="90" w:after="90"/>
+        <w:rPr>
+          <w:rFonts w:ascii="Arial" w:hAnsi="Arial" w:cs="Arial"/>
+        </w:rPr>
+      </w:pPr>
+      <w:r>
+        <w:rPr>
+          <w:rFonts w:ascii="Arial" w:hAnsi="Arial" w:cs="Arial"/>
+        </w:rPr>
+        <w:t>git push origin main</w:t>
       </w:r>
     </w:p>
     <w:sectPr>

</xml_diff>